<commit_message>
docs(report): set arial as the document font
</commit_message>
<xml_diff>
--- a/Analise de Resultados.docx
+++ b/Analise de Resultados.docx
@@ -855,7 +855,11 @@
 <file path=word/styles.xml><?xml version="1.0" encoding="utf-8"?>
 <w:styles xmlns:mc="http://schemas.openxmlformats.org/markup-compatibility/2006" xmlns:r="http://schemas.openxmlformats.org/officeDocument/2006/relationships" xmlns:w="http://schemas.openxmlformats.org/wordprocessingml/2006/main" xmlns:w14="http://schemas.microsoft.com/office/word/2010/wordml" xmlns:w15="http://schemas.microsoft.com/office/word/2012/wordml" mc:Ignorable="w14 w15">
   <w:docDefaults>
-    <w:rPrDefault/>
+    <w:rPrDefault>
+      <w:rPr>
+        <w:rFonts w:ascii="Arial" w:cs="Arial" w:eastAsia="Arial" w:hAnsi="Arial"/>
+      </w:rPr>
+    </w:rPrDefault>
     <w:pPrDefault/>
   </w:docDefaults>
   <w:style w:type="paragraph" w:styleId="Title">
@@ -874,9 +878,7 @@
     <w:next w:val="Normal"/>
     <w:qFormat/>
     <w:rPr>
-      <w:color w:val="2E74B5"/>
-      <w:sz w:val="32"/>
-      <w:szCs w:val="32"/>
+      <w:rFonts w:ascii="Arial" w:cs="Arial" w:eastAsia="Arial" w:hAnsi="Arial"/>
     </w:rPr>
   </w:style>
   <w:style w:type="paragraph" w:styleId="Heading2">
@@ -885,9 +887,7 @@
     <w:next w:val="Normal"/>
     <w:qFormat/>
     <w:rPr>
-      <w:color w:val="2E74B5"/>
-      <w:sz w:val="26"/>
-      <w:szCs w:val="26"/>
+      <w:rFonts w:ascii="Arial" w:cs="Arial" w:eastAsia="Arial" w:hAnsi="Arial"/>
     </w:rPr>
   </w:style>
   <w:style w:type="paragraph" w:styleId="Heading3">

</xml_diff>

<commit_message>
docs(report): update outputs, readme and report for the single-model version
</commit_message>
<xml_diff>
--- a/Analise de Resultados.docx
+++ b/Analise de Resultados.docx
@@ -101,7 +101,7 @@
         <w:spacing w:after="100"/>
       </w:pPr>
       <w:r>
-        <w:t xml:space="preserve">Dois modelos de regressão foram treinados e comparados: Regressão Linear (baseline simples) e Random Forest (captura relações não lineares).</w:t>
+        <w:t xml:space="preserve">Modelo utilizado: Regressão Linear, por ser simples, interpretável e adequado à relação aproximadamente linear entre as variáveis e a nota final.</w:t>
       </w:r>
     </w:p>
     <w:p>
@@ -143,7 +143,7 @@
         <w:spacing w:after="200"/>
       </w:pPr>
       <w:r>
-        <w:t xml:space="preserve">Para cada modelo, calculou-se o erro de previsão (nota real − nota prevista) no conjunto de teste, e a partir dele a média e o desvio padrão do erro, além do intervalo de erro de 95% (±1,96 × desvio padrão).</w:t>
+        <w:t xml:space="preserve">Calculou-se o erro de previsão (nota real − nota prevista) no conjunto de teste, e a partir dele a média e o desvio padrão do erro, além do intervalo de erro de 95% (±1,96 × desvio padrão).</w:t>
       </w:r>
     </w:p>
     <w:tbl>
@@ -159,14 +159,13 @@
         </w:tblBorders>
       </w:tblPr>
       <w:tblGrid>
-        <w:gridCol w:w="3000"/>
-        <w:gridCol w:w="3000"/>
-        <w:gridCol w:w="3000"/>
+        <w:gridCol w:w="4500"/>
+        <w:gridCol w:w="4500"/>
       </w:tblGrid>
       <w:tr>
         <w:tc>
           <w:tcPr>
-            <w:tcW w:type="dxa" w:w="3000"/>
+            <w:tcW w:type="dxa" w:w="4500"/>
             <w:shd w:fill="2563EB" w:val="clear"/>
           </w:tcPr>
           <w:p>
@@ -182,7 +181,7 @@
         </w:tc>
         <w:tc>
           <w:tcPr>
-            <w:tcW w:type="dxa" w:w="3000"/>
+            <w:tcW w:type="dxa" w:w="4500"/>
             <w:shd w:fill="2563EB" w:val="clear"/>
           </w:tcPr>
           <w:p>
@@ -192,23 +191,7 @@
                 <w:bCs/>
                 <w:color w:val="FFFFFF"/>
               </w:rPr>
-              <w:t xml:space="preserve">Regressão Linear</w:t>
-            </w:r>
-          </w:p>
-        </w:tc>
-        <w:tc>
-          <w:tcPr>
-            <w:tcW w:type="dxa" w:w="3000"/>
-            <w:shd w:fill="2563EB" w:val="clear"/>
-          </w:tcPr>
-          <w:p>
-            <w:r>
-              <w:rPr>
-                <w:b/>
-                <w:bCs/>
-                <w:color w:val="FFFFFF"/>
-              </w:rPr>
-              <w:t xml:space="preserve">Random Forest</w:t>
+              <w:t xml:space="preserve">Valor</w:t>
             </w:r>
           </w:p>
         </w:tc>
@@ -216,7 +199,7 @@
       <w:tr>
         <w:tc>
           <w:tcPr>
-            <w:tcW w:type="dxa" w:w="3000"/>
+            <w:tcW w:type="dxa" w:w="4500"/>
           </w:tcPr>
           <w:p>
             <w:r>
@@ -226,21 +209,11 @@
         </w:tc>
         <w:tc>
           <w:tcPr>
-            <w:tcW w:type="dxa" w:w="3000"/>
+            <w:tcW w:type="dxa" w:w="4500"/>
           </w:tcPr>
           <w:p>
             <w:r>
               <w:t xml:space="preserve">0,706</w:t>
-            </w:r>
-          </w:p>
-        </w:tc>
-        <w:tc>
-          <w:tcPr>
-            <w:tcW w:type="dxa" w:w="3000"/>
-          </w:tcPr>
-          <w:p>
-            <w:r>
-              <w:t xml:space="preserve">0,781</w:t>
             </w:r>
           </w:p>
         </w:tc>
@@ -248,7 +221,7 @@
       <w:tr>
         <w:tc>
           <w:tcPr>
-            <w:tcW w:type="dxa" w:w="3000"/>
+            <w:tcW w:type="dxa" w:w="4500"/>
           </w:tcPr>
           <w:p>
             <w:r>
@@ -258,21 +231,11 @@
         </w:tc>
         <w:tc>
           <w:tcPr>
-            <w:tcW w:type="dxa" w:w="3000"/>
+            <w:tcW w:type="dxa" w:w="4500"/>
           </w:tcPr>
           <w:p>
             <w:r>
               <w:t xml:space="preserve">0,831</w:t>
-            </w:r>
-          </w:p>
-        </w:tc>
-        <w:tc>
-          <w:tcPr>
-            <w:tcW w:type="dxa" w:w="3000"/>
-          </w:tcPr>
-          <w:p>
-            <w:r>
-              <w:t xml:space="preserve">0,959</w:t>
             </w:r>
           </w:p>
         </w:tc>
@@ -280,7 +243,7 @@
       <w:tr>
         <w:tc>
           <w:tcPr>
-            <w:tcW w:type="dxa" w:w="3000"/>
+            <w:tcW w:type="dxa" w:w="4500"/>
           </w:tcPr>
           <w:p>
             <w:r>
@@ -290,21 +253,11 @@
         </w:tc>
         <w:tc>
           <w:tcPr>
-            <w:tcW w:type="dxa" w:w="3000"/>
+            <w:tcW w:type="dxa" w:w="4500"/>
           </w:tcPr>
           <w:p>
             <w:r>
               <w:t xml:space="preserve">0,802</w:t>
-            </w:r>
-          </w:p>
-        </w:tc>
-        <w:tc>
-          <w:tcPr>
-            <w:tcW w:type="dxa" w:w="3000"/>
-          </w:tcPr>
-          <w:p>
-            <w:r>
-              <w:t xml:space="preserve">0,737</w:t>
             </w:r>
           </w:p>
         </w:tc>
@@ -312,7 +265,7 @@
       <w:tr>
         <w:tc>
           <w:tcPr>
-            <w:tcW w:type="dxa" w:w="3000"/>
+            <w:tcW w:type="dxa" w:w="4500"/>
           </w:tcPr>
           <w:p>
             <w:r>
@@ -322,21 +275,11 @@
         </w:tc>
         <w:tc>
           <w:tcPr>
-            <w:tcW w:type="dxa" w:w="3000"/>
+            <w:tcW w:type="dxa" w:w="4500"/>
           </w:tcPr>
           <w:p>
             <w:r>
               <w:t xml:space="preserve">0,038</w:t>
-            </w:r>
-          </w:p>
-        </w:tc>
-        <w:tc>
-          <w:tcPr>
-            <w:tcW w:type="dxa" w:w="3000"/>
-          </w:tcPr>
-          <w:p>
-            <w:r>
-              <w:t xml:space="preserve">0,068</w:t>
             </w:r>
           </w:p>
         </w:tc>
@@ -344,7 +287,7 @@
       <w:tr>
         <w:tc>
           <w:tcPr>
-            <w:tcW w:type="dxa" w:w="3000"/>
+            <w:tcW w:type="dxa" w:w="4500"/>
           </w:tcPr>
           <w:p>
             <w:r>
@@ -354,21 +297,11 @@
         </w:tc>
         <w:tc>
           <w:tcPr>
-            <w:tcW w:type="dxa" w:w="3000"/>
+            <w:tcW w:type="dxa" w:w="4500"/>
           </w:tcPr>
           <w:p>
             <w:r>
               <w:t xml:space="preserve">0,834</w:t>
-            </w:r>
-          </w:p>
-        </w:tc>
-        <w:tc>
-          <w:tcPr>
-            <w:tcW w:type="dxa" w:w="3000"/>
-          </w:tcPr>
-          <w:p>
-            <w:r>
-              <w:t xml:space="preserve">0,962</w:t>
             </w:r>
           </w:p>
         </w:tc>
@@ -376,7 +309,7 @@
       <w:tr>
         <w:tc>
           <w:tcPr>
-            <w:tcW w:type="dxa" w:w="3000"/>
+            <w:tcW w:type="dxa" w:w="4500"/>
           </w:tcPr>
           <w:p>
             <w:r>
@@ -386,21 +319,11 @@
         </w:tc>
         <w:tc>
           <w:tcPr>
-            <w:tcW w:type="dxa" w:w="3000"/>
+            <w:tcW w:type="dxa" w:w="4500"/>
           </w:tcPr>
           <w:p>
             <w:r>
               <w:t xml:space="preserve">± 1,635 pontos</w:t>
-            </w:r>
-          </w:p>
-        </w:tc>
-        <w:tc>
-          <w:tcPr>
-            <w:tcW w:type="dxa" w:w="3000"/>
-          </w:tcPr>
-          <w:p>
-            <w:r>
-              <w:t xml:space="preserve">± 1,885 pontos</w:t>
             </w:r>
           </w:p>
         </w:tc>
@@ -410,18 +333,6 @@
       <w:pPr>
         <w:spacing w:after="200"/>
       </w:pPr>
-    </w:p>
-    <w:p>
-      <w:pPr>
-        <w:spacing w:after="200"/>
-      </w:pPr>
-      <w:r>
-        <w:rPr>
-          <w:b/>
-          <w:bCs/>
-        </w:rPr>
-        <w:t xml:space="preserve">O modelo com melhor desempenho foi a Regressão Linear, com R² = 0,802.</w:t>
-      </w:r>
     </w:p>
     <w:p>
       <w:pPr>
@@ -630,7 +541,7 @@
         <w:spacing w:after="200"/>
       </w:pPr>
       <w:r>
-        <w:t xml:space="preserve">Com R² = 0,802, o modelo de Regressão Linear explica cerca de 80% da variação da nota final a partir das quatro variáveis utilizadas — um desempenho bom, considerando o ruído proposital na geração dos dados.</w:t>
+        <w:t xml:space="preserve">Com R² = 0,802, o modelo explica cerca de 80% da variação da nota final a partir das quatro variáveis utilizadas — um desempenho bom, considerando o ruído proposital na geração dos dados.</w:t>
       </w:r>
     </w:p>
     <w:p>
@@ -647,14 +558,6 @@
       </w:pPr>
       <w:r>
         <w:t xml:space="preserve">O desvio padrão do erro (0,834) e o intervalo de erro de 95% (±1,635 pontos, em uma escala de 0 a 10) indicam a margem de incerteza típica de cada previsão individual: para um aluno específico, a nota prevista pode variar, com 95% de confiança, dentro de uma faixa de aproximadamente 3,3 pontos em torno do valor real.</w:t>
-      </w:r>
-    </w:p>
-    <w:p>
-      <w:pPr>
-        <w:spacing w:after="200"/>
-      </w:pPr>
-      <w:r>
-        <w:t xml:space="preserve">A Regressão Linear superou o Random Forest porque a nota final foi gerada a partir de uma relação linear entre as variáveis (mais ruído aleatório) — quando a relação real é linear, um modelo linear tende a generalizar melhor do que um modelo mais complexo, que pode se ajustar demais ao ruído do treino (overfitting).</w:t>
       </w:r>
     </w:p>
     <w:p>

</xml_diff>